<commit_message>
fix(lab02): ajustes da revisão final (ponteiro do código, passo 1A.2, texto do 2B.2, ⚡ do Doc 3)
Co-Authored-By: Claude Sonnet 5.5 <noreply@anthropic.com>
</commit_message>
<xml_diff>
--- a/labs/lab02_displays_7seg/roteiro_duplas/docx/doc1_do_bit_ao_segmento.docx
+++ b/labs/lab02_displays_7seg/roteiro_duplas/docx/doc1_do_bit_ao_segmento.docx
@@ -1217,7 +1217,7 @@
         </w:r>
       </w:hyperlink>
       <w:r>
-        <w:t xml:space="preserve">, na pasta</w:t>
+        <w:t xml:space="preserve">, no sketch</w:t>
       </w:r>
       <w:r>
         <w:t xml:space="preserve"> </w:t>
@@ -1226,10 +1226,25 @@
         <w:rPr>
           <w:rStyle w:val="VerbatimChar"/>
         </w:rPr>
+        <w:t xml:space="preserve">a1_bcd_cd4511</w:t>
+      </w:r>
+      <w:r>
+        <w:t xml:space="preserve"> </w:t>
+      </w:r>
+      <w:r>
+        <w:t xml:space="preserve">(pasta</w:t>
+      </w:r>
+      <w:r>
+        <w:t xml:space="preserve"> </w:t>
+      </w:r>
+      <w:r>
+        <w:rPr>
+          <w:rStyle w:val="VerbatimChar"/>
+        </w:rPr>
         <w:t xml:space="preserve">labs/lab02_displays_7seg/codigo_base</w:t>
       </w:r>
       <w:r>
-        <w:t xml:space="preserve">, ou no link que o professor enviar no Telegram.</w:t>
+        <w:t xml:space="preserve">), ou no link que o professor enviar no Telegram.</w:t>
       </w:r>
     </w:p>
     <w:tbl>
@@ -3420,7 +3435,19 @@
         <w:t xml:space="preserve">VSS → GND</w:t>
       </w:r>
       <w:r>
-        <w:t xml:space="preserve">. Ligue</w:t>
+        <w:t xml:space="preserve">.</w:t>
+      </w:r>
+    </w:p>
+    <w:p>
+      <w:pPr>
+        <w:pStyle w:val="Compact"/>
+        <w:numPr>
+          <w:ilvl w:val="0"/>
+          <w:numId w:val="1008"/>
+        </w:numPr>
+      </w:pPr>
+      <w:r>
+        <w:t xml:space="preserve">Ligue os pinos de controle:</w:t>
       </w:r>
       <w:r>
         <w:t xml:space="preserve"> </w:t>
@@ -3940,7 +3967,7 @@
         <w:t xml:space="preserve">não precisa mais fazer</w:t>
       </w:r>
       <w:r>
-        <w:t xml:space="preserve">? Quantos pinos do Arduino ele economiza (4 em vez de quantos)? ______________________</w:t>
+        <w:t xml:space="preserve">? Sem o CI, quantos fios o Arduino precisaria para acender os segmentos? E com o CI, quantos usa? Quantos pinos o CD4511 economiza? ______________________</w:t>
       </w:r>
     </w:p>
     <w:p>
@@ -3982,7 +4009,7 @@
         <w:t xml:space="preserve"> </w:t>
       </w:r>
       <w:r>
-        <w:t xml:space="preserve">confira que tem: tabela BCD de 0 a 9 · previsão 1A.1-2 · diferença com o esquema (1A.2-5) · conta do 1A.3-2 · GIF ou prints da contagem · resposta 1A.3-4</w:t>
+        <w:t xml:space="preserve">confira que tem: tabela BCD de 0 a 9 · previsão 1A.1-2 · diferença com o esquema (1A.2-6) · conta do 1A.3-2 · GIF ou prints da contagem · resposta 1A.3-4</w:t>
       </w:r>
     </w:p>
     <w:p>
@@ -5456,6 +5483,38 @@
       </w:pPr>
       <w:r>
         <w:t xml:space="preserve">Completem 4 a 9. Se o tempo apertar, deixem 4 a 9 para testar depois de o 0 a 3 funcionar.</w:t>
+      </w:r>
+      <w:r>
+        <w:t xml:space="preserve"> </w:t>
+      </w:r>
+      <w:r>
+        <w:rPr>
+          <w:b/>
+          <w:bCs/>
+        </w:rPr>
+        <w:t xml:space="preserve">Atenção:</w:t>
+      </w:r>
+      <w:r>
+        <w:t xml:space="preserve"> </w:t>
+      </w:r>
+      <w:r>
+        <w:t xml:space="preserve">se pularem os dígitos 4 a 9 por enquanto, o display ficará</w:t>
+      </w:r>
+      <w:r>
+        <w:t xml:space="preserve"> </w:t>
+      </w:r>
+      <w:r>
+        <w:rPr>
+          <w:b/>
+          <w:bCs/>
+        </w:rPr>
+        <w:t xml:space="preserve">apagado</w:t>
+      </w:r>
+      <w:r>
+        <w:t xml:space="preserve"> </w:t>
+      </w:r>
+      <w:r>
+        <w:t xml:space="preserve">nesses números na contagem do 1B.3. Isso é esperado, não é erro de montagem.</w:t>
       </w:r>
     </w:p>
     <w:p>

</xml_diff>